<commit_message>
docs: 2-joystick section updated to match the app exactly (pad labels, slide buttons, spring-centre, tuning)
</commit_message>
<xml_diff>
--- a/docs/setup-commands-joysticks-camera.docx
+++ b/docs/setup-commands-joysticks-camera.docx
@@ -937,152 +937,235 @@
           <w:b/>
           <w:spacing w:val="0"/>
         </w:rPr>
-        <w:t xml:space="preserve">2.1 Layout</w:t>
-      </w:r>
-    </w:p>
-    <w:p>
-      <w:pPr>
-        <w:ind w:left="720" w:first-line="-720"/>
-      </w:pPr>
-      <w:r>
-        <w:rPr>
-          <w:rFonts w:ascii="Times" w:hAnsi="Times" w:cs="Times"/>
-          <w:sz w:val="24"/>
-          <w:sz-cs w:val="24"/>
-          <w:b/>
-        </w:rPr>
-        <w:t xml:space="preserve"/>
-        <w:tab/>
-        <w:t xml:space="preserve">•</w:t>
-        <w:tab/>
-        <w:t xml:space="preserve"/>
-      </w:r>
-      <w:r>
-        <w:rPr>
-          <w:rFonts w:ascii="Times" w:hAnsi="Times" w:cs="Times"/>
-          <w:sz w:val="24"/>
-          <w:sz-cs w:val="24"/>
-          <w:b/>
-          <w:spacing w:val="0"/>
-        </w:rPr>
-        <w:t xml:space="preserve">Left stick</w:t>
-      </w:r>
-      <w:r>
-        <w:rPr>
-          <w:rFonts w:ascii="Times" w:hAnsi="Times" w:cs="Times"/>
-          <w:sz w:val="24"/>
-          <w:sz-cs w:val="24"/>
-          <w:spacing w:val="0"/>
-        </w:rPr>
-        <w:t xml:space="preserve"> — up/down = forward/back · left/right = turn.</w:t>
-      </w:r>
-    </w:p>
-    <w:p>
-      <w:pPr>
-        <w:ind w:left="720" w:first-line="-720"/>
-      </w:pPr>
-      <w:r>
-        <w:rPr>
-          <w:rFonts w:ascii="Times" w:hAnsi="Times" w:cs="Times"/>
-          <w:sz w:val="24"/>
-          <w:sz-cs w:val="24"/>
-          <w:b/>
-        </w:rPr>
-        <w:t xml:space="preserve"/>
-        <w:tab/>
-        <w:t xml:space="preserve">•</w:t>
-        <w:tab/>
-        <w:t xml:space="preserve"/>
-      </w:r>
-      <w:r>
-        <w:rPr>
-          <w:rFonts w:ascii="Times" w:hAnsi="Times" w:cs="Times"/>
-          <w:sz w:val="24"/>
-          <w:sz-cs w:val="24"/>
-          <w:b/>
-          <w:spacing w:val="0"/>
-        </w:rPr>
-        <w:t xml:space="preserve">Right stick</w:t>
-      </w:r>
-      <w:r>
-        <w:rPr>
-          <w:rFonts w:ascii="Times" w:hAnsi="Times" w:cs="Times"/>
-          <w:sz w:val="24"/>
-          <w:sz-cs w:val="24"/>
-          <w:spacing w:val="0"/>
-        </w:rPr>
-        <w:t xml:space="preserve"> — left/right = slide (side-walk) · up/down = forward/back (if both sticks push forward, the stronger one wins).</w:t>
-      </w:r>
-    </w:p>
-    <w:p>
-      <w:pPr>
-        <w:ind w:left="720" w:first-line="-720"/>
-      </w:pPr>
-      <w:r>
-        <w:rPr>
-          <w:rFonts w:ascii="Times" w:hAnsi="Times" w:cs="Times"/>
-          <w:sz w:val="24"/>
-          <w:sz-cs w:val="24"/>
-        </w:rPr>
-        <w:t xml:space="preserve"/>
-        <w:tab/>
-        <w:t xml:space="preserve">•</w:t>
-        <w:tab/>
-        <w:t xml:space="preserve"/>
-      </w:r>
-      <w:r>
-        <w:rPr>
-          <w:rFonts w:ascii="Times" w:hAnsi="Times" w:cs="Times"/>
-          <w:sz w:val="24"/>
-          <w:sz-cs w:val="24"/>
-          <w:spacing w:val="0"/>
-        </w:rPr>
-        <w:t xml:space="preserve">Diagonals combine axes (e.g. forward + slide, or forward + turn).</w:t>
-      </w:r>
-    </w:p>
-    <w:p>
-      <w:pPr>
-        <w:ind w:left="720" w:first-line="-720"/>
-      </w:pPr>
-      <w:r>
-        <w:rPr>
-          <w:rFonts w:ascii="Times" w:hAnsi="Times" w:cs="Times"/>
-          <w:sz w:val="24"/>
-          <w:sz-cs w:val="24"/>
-        </w:rPr>
-        <w:t xml:space="preserve"/>
-        <w:tab/>
-        <w:t xml:space="preserve">•</w:t>
-        <w:tab/>
-        <w:t xml:space="preserve"/>
-      </w:r>
-      <w:r>
-        <w:rPr>
-          <w:rFonts w:ascii="Times" w:hAnsi="Times" w:cs="Times"/>
-          <w:sz w:val="24"/>
-          <w:sz-cs w:val="24"/>
-          <w:spacing w:val="0"/>
-        </w:rPr>
-        <w:t xml:space="preserve">Both sticks are </w:t>
-      </w:r>
-      <w:r>
-        <w:rPr>
-          <w:rFonts w:ascii="Times" w:hAnsi="Times" w:cs="Times"/>
-          <w:sz w:val="24"/>
-          <w:sz-cs w:val="24"/>
-          <w:b/>
-          <w:spacing w:val="0"/>
-        </w:rPr>
-        <w:t xml:space="preserve">spring-centred</w:t>
-      </w:r>
-      <w:r>
-        <w:rPr>
-          <w:rFonts w:ascii="Times" w:hAnsi="Times" w:cs="Times"/>
-          <w:sz w:val="24"/>
-          <w:sz-cs w:val="24"/>
-          <w:spacing w:val="0"/>
-        </w:rPr>
-        <w:t xml:space="preserve">: release = knob returns to centre and the robot stops (a brake frame is sent immediately).</w:t>
+        <w:t xml:space="preserve">2.1 Layout (exactly as in the app)</w:t>
+      </w:r>
+    </w:p>
+    <w:p>
+      <w:pPr>
+        <w:ind w:left="720" w:first-line="-720"/>
+      </w:pPr>
+      <w:r>
+        <w:rPr>
+          <w:rFonts w:ascii="Times" w:hAnsi="Times" w:cs="Times"/>
+          <w:sz w:val="24"/>
+          <w:sz-cs w:val="24"/>
+          <w:b/>
+        </w:rPr>
+        <w:t xml:space="preserve"/>
+        <w:tab/>
+        <w:t xml:space="preserve">•</w:t>
+        <w:tab/>
+        <w:t xml:space="preserve"/>
+      </w:r>
+      <w:r>
+        <w:rPr>
+          <w:rFonts w:ascii="Times" w:hAnsi="Times" w:cs="Times"/>
+          <w:sz w:val="24"/>
+          <w:sz-cs w:val="24"/>
+          <w:b/>
+          <w:spacing w:val="0"/>
+        </w:rPr>
+        <w:t xml:space="preserve">Left pad</w:t>
+      </w:r>
+      <w:r>
+        <w:rPr>
+          <w:rFonts w:ascii="Times" w:hAnsi="Times" w:cs="Times"/>
+          <w:sz w:val="24"/>
+          <w:sz-cs w:val="24"/>
+          <w:spacing w:val="0"/>
+        </w:rPr>
+        <w:t xml:space="preserve"> — labelled FWD · turn ← → · BACK: up/down = forward/back, left/right = </w:t>
+      </w:r>
+      <w:r>
+        <w:rPr>
+          <w:rFonts w:ascii="Times" w:hAnsi="Times" w:cs="Times"/>
+          <w:sz w:val="24"/>
+          <w:sz-cs w:val="24"/>
+          <w:b/>
+          <w:spacing w:val="0"/>
+        </w:rPr>
+        <w:t xml:space="preserve">turn</w:t>
+      </w:r>
+      <w:r>
+        <w:rPr>
+          <w:rFonts w:ascii="Times" w:hAnsi="Times" w:cs="Times"/>
+          <w:sz w:val="24"/>
+          <w:sz-cs w:val="24"/>
+          <w:spacing w:val="0"/>
+        </w:rPr>
+        <w:t xml:space="preserve">.</w:t>
+      </w:r>
+    </w:p>
+    <w:p>
+      <w:pPr>
+        <w:ind w:left="720" w:first-line="-720"/>
+      </w:pPr>
+      <w:r>
+        <w:rPr>
+          <w:rFonts w:ascii="Times" w:hAnsi="Times" w:cs="Times"/>
+          <w:sz w:val="24"/>
+          <w:sz-cs w:val="24"/>
+          <w:b/>
+        </w:rPr>
+        <w:t xml:space="preserve"/>
+        <w:tab/>
+        <w:t xml:space="preserve">•</w:t>
+        <w:tab/>
+        <w:t xml:space="preserve"/>
+      </w:r>
+      <w:r>
+        <w:rPr>
+          <w:rFonts w:ascii="Times" w:hAnsi="Times" w:cs="Times"/>
+          <w:sz w:val="24"/>
+          <w:sz-cs w:val="24"/>
+          <w:b/>
+          <w:spacing w:val="0"/>
+        </w:rPr>
+        <w:t xml:space="preserve">Right pad</w:t>
+      </w:r>
+      <w:r>
+        <w:rPr>
+          <w:rFonts w:ascii="Times" w:hAnsi="Times" w:cs="Times"/>
+          <w:sz w:val="24"/>
+          <w:sz-cs w:val="24"/>
+          <w:spacing w:val="0"/>
+        </w:rPr>
+        <w:t xml:space="preserve"> — labelled FWD · slide ← → · BACK: left/right = </w:t>
+      </w:r>
+      <w:r>
+        <w:rPr>
+          <w:rFonts w:ascii="Times" w:hAnsi="Times" w:cs="Times"/>
+          <w:sz w:val="24"/>
+          <w:sz-cs w:val="24"/>
+          <w:b/>
+          <w:spacing w:val="0"/>
+        </w:rPr>
+        <w:t xml:space="preserve">slide sideways</w:t>
+      </w:r>
+      <w:r>
+        <w:rPr>
+          <w:rFonts w:ascii="Times" w:hAnsi="Times" w:cs="Times"/>
+          <w:sz w:val="24"/>
+          <w:sz-cs w:val="24"/>
+          <w:spacing w:val="0"/>
+        </w:rPr>
+        <w:t xml:space="preserve">, up/down = forward/back. If both pads push forward, the stronger one applies.</w:t>
+      </w:r>
+    </w:p>
+    <w:p>
+      <w:pPr>
+        <w:ind w:left="720" w:first-line="-720"/>
+      </w:pPr>
+      <w:r>
+        <w:rPr>
+          <w:rFonts w:ascii="Times" w:hAnsi="Times" w:cs="Times"/>
+          <w:sz w:val="24"/>
+          <w:sz-cs w:val="24"/>
+        </w:rPr>
+        <w:t xml:space="preserve"/>
+        <w:tab/>
+        <w:t xml:space="preserve">•</w:t>
+        <w:tab/>
+        <w:t xml:space="preserve"/>
+      </w:r>
+      <w:r>
+        <w:rPr>
+          <w:rFonts w:ascii="Times" w:hAnsi="Times" w:cs="Times"/>
+          <w:sz w:val="24"/>
+          <w:sz-cs w:val="24"/>
+          <w:spacing w:val="0"/>
+        </w:rPr>
+        <w:t xml:space="preserve">Diagonals combine axes (forward + turn, forward + slide, etc.).</w:t>
+      </w:r>
+    </w:p>
+    <w:p>
+      <w:pPr>
+        <w:ind w:left="720" w:first-line="-720"/>
+      </w:pPr>
+      <w:r>
+        <w:rPr>
+          <w:rFonts w:ascii="Times" w:hAnsi="Times" w:cs="Times"/>
+          <w:sz w:val="24"/>
+          <w:sz-cs w:val="24"/>
+        </w:rPr>
+        <w:t xml:space="preserve"/>
+        <w:tab/>
+        <w:t xml:space="preserve">•</w:t>
+        <w:tab/>
+        <w:t xml:space="preserve"/>
+      </w:r>
+      <w:r>
+        <w:rPr>
+          <w:rFonts w:ascii="Times" w:hAnsi="Times" w:cs="Times"/>
+          <w:sz w:val="24"/>
+          <w:sz-cs w:val="24"/>
+          <w:spacing w:val="0"/>
+        </w:rPr>
+        <w:t xml:space="preserve">Above the pads: </w:t>
+      </w:r>
+      <w:r>
+        <w:rPr>
+          <w:rFonts w:ascii="Times" w:hAnsi="Times" w:cs="Times"/>
+          <w:sz w:val="24"/>
+          <w:sz-cs w:val="24"/>
+          <w:b/>
+          <w:spacing w:val="0"/>
+        </w:rPr>
+        <w:t xml:space="preserve">↤ Slide left</w:t>
+      </w:r>
+      <w:r>
+        <w:rPr>
+          <w:rFonts w:ascii="Times" w:hAnsi="Times" w:cs="Times"/>
+          <w:sz w:val="24"/>
+          <w:sz-cs w:val="24"/>
+          <w:spacing w:val="0"/>
+        </w:rPr>
+        <w:t xml:space="preserve"> and </w:t>
+      </w:r>
+      <w:r>
+        <w:rPr>
+          <w:rFonts w:ascii="Times" w:hAnsi="Times" w:cs="Times"/>
+          <w:sz w:val="24"/>
+          <w:sz-cs w:val="24"/>
+          <w:b/>
+          <w:spacing w:val="0"/>
+        </w:rPr>
+        <w:t xml:space="preserve">↦ Slide right</w:t>
+      </w:r>
+      <w:r>
+        <w:rPr>
+          <w:rFonts w:ascii="Times" w:hAnsi="Times" w:cs="Times"/>
+          <w:sz w:val="24"/>
+          <w:sz-cs w:val="24"/>
+          <w:spacing w:val="0"/>
+        </w:rPr>
+        <w:t xml:space="preserve"> buttons — hold either to side-walk without using the right pad.</w:t>
+      </w:r>
+    </w:p>
+    <w:p>
+      <w:pPr>
+        <w:ind w:left="720" w:first-line="-720"/>
+      </w:pPr>
+      <w:r>
+        <w:rPr>
+          <w:rFonts w:ascii="Times" w:hAnsi="Times" w:cs="Times"/>
+          <w:sz w:val="24"/>
+          <w:sz-cs w:val="24"/>
+        </w:rPr>
+        <w:t xml:space="preserve"/>
+        <w:tab/>
+        <w:t xml:space="preserve">•</w:t>
+        <w:tab/>
+        <w:t xml:space="preserve"/>
+      </w:r>
+      <w:r>
+        <w:rPr>
+          <w:rFonts w:ascii="Times" w:hAnsi="Times" w:cs="Times"/>
+          <w:sz w:val="24"/>
+          <w:sz-cs w:val="24"/>
+          <w:spacing w:val="0"/>
+        </w:rPr>
+        <w:t xml:space="preserve">The readout under the pads shows the live values: fwd · side · turn.</w:t>
       </w:r>
     </w:p>
     <w:p>
@@ -1097,115 +1180,104 @@
           <w:b/>
           <w:spacing w:val="0"/>
         </w:rPr>
-        <w:t xml:space="preserve">2.2 Stopping</w:t>
-      </w:r>
-    </w:p>
-    <w:p>
-      <w:pPr>
-        <w:ind w:left="720" w:first-line="-720"/>
-      </w:pPr>
-      <w:r>
-        <w:rPr>
-          <w:rFonts w:ascii="Times" w:hAnsi="Times" w:cs="Times"/>
-          <w:sz w:val="24"/>
-          <w:sz-cs w:val="24"/>
-        </w:rPr>
-        <w:t xml:space="preserve"/>
-        <w:tab/>
-        <w:t xml:space="preserve">•</w:t>
-        <w:tab/>
-        <w:t xml:space="preserve"/>
-      </w:r>
-      <w:r>
-        <w:rPr>
-          <w:rFonts w:ascii="Times" w:hAnsi="Times" w:cs="Times"/>
-          <w:sz w:val="24"/>
-          <w:sz-cs w:val="24"/>
-          <w:spacing w:val="0"/>
-        </w:rPr>
-        <w:t xml:space="preserve">Release either stick (or return it to centre) → stop.</w:t>
-      </w:r>
-    </w:p>
-    <w:p>
-      <w:pPr>
-        <w:ind w:left="720" w:first-line="-720"/>
-      </w:pPr>
-      <w:r>
-        <w:rPr>
-          <w:rFonts w:ascii="Times" w:hAnsi="Times" w:cs="Times"/>
-          <w:sz w:val="24"/>
-          <w:sz-cs w:val="24"/>
-          <w:b/>
-        </w:rPr>
-        <w:t xml:space="preserve"/>
-        <w:tab/>
-        <w:t xml:space="preserve">•</w:t>
-        <w:tab/>
-        <w:t xml:space="preserve"/>
-      </w:r>
-      <w:r>
-        <w:rPr>
-          <w:rFonts w:ascii="Times" w:hAnsi="Times" w:cs="Times"/>
-          <w:sz w:val="24"/>
-          <w:sz-cs w:val="24"/>
-          <w:b/>
-          <w:spacing w:val="0"/>
-        </w:rPr>
-        <w:t xml:space="preserve">STOP</w:t>
-      </w:r>
-      <w:r>
-        <w:rPr>
-          <w:rFonts w:ascii="Times" w:hAnsi="Times" w:cs="Times"/>
-          <w:sz w:val="24"/>
-          <w:sz-cs w:val="24"/>
-          <w:spacing w:val="0"/>
-        </w:rPr>
-        <w:t xml:space="preserve"> button → official brake frames. </w:t>
-      </w:r>
-      <w:r>
-        <w:rPr>
-          <w:rFonts w:ascii="Times" w:hAnsi="Times" w:cs="Times"/>
-          <w:sz w:val="24"/>
-          <w:sz-cs w:val="24"/>
-          <w:b/>
-          <w:spacing w:val="0"/>
-        </w:rPr>
-        <w:t xml:space="preserve">E-STOP</w:t>
-      </w:r>
-      <w:r>
-        <w:rPr>
-          <w:rFonts w:ascii="Times" w:hAnsi="Times" w:cs="Times"/>
-          <w:sz w:val="24"/>
-          <w:sz-cs w:val="24"/>
-          <w:spacing w:val="0"/>
-        </w:rPr>
-        <w:t xml:space="preserve"> → latches until ⟲ Return.</w:t>
-      </w:r>
-    </w:p>
-    <w:p>
-      <w:pPr>
-        <w:ind w:left="720" w:first-line="-720"/>
-      </w:pPr>
-      <w:r>
-        <w:rPr>
-          <w:rFonts w:ascii="Times" w:hAnsi="Times" w:cs="Times"/>
-          <w:sz w:val="24"/>
-          <w:sz-cs w:val="24"/>
-        </w:rPr>
-        <w:t xml:space="preserve"/>
-        <w:tab/>
-        <w:t xml:space="preserve">•</w:t>
-        <w:tab/>
-        <w:t xml:space="preserve"/>
-      </w:r>
-      <w:r>
-        <w:rPr>
-          <w:rFonts w:ascii="Times" w:hAnsi="Times" w:cs="Times"/>
-          <w:sz w:val="24"/>
-          <w:sz-cs w:val="24"/>
-          <w:spacing w:val="0"/>
-        </w:rPr>
-        <w:t xml:space="preserve">Switching browser tab / losing window focus also stops the robot (safety).</w:t>
+        <w:t xml:space="preserve">2.2 Behaviour</w:t>
+      </w:r>
+    </w:p>
+    <w:p>
+      <w:pPr>
+        <w:ind w:left="720" w:first-line="-720"/>
+      </w:pPr>
+      <w:r>
+        <w:rPr>
+          <w:rFonts w:ascii="Times" w:hAnsi="Times" w:cs="Times"/>
+          <w:sz w:val="24"/>
+          <w:sz-cs w:val="24"/>
+        </w:rPr>
+        <w:t xml:space="preserve"/>
+        <w:tab/>
+        <w:t xml:space="preserve">•</w:t>
+        <w:tab/>
+        <w:t xml:space="preserve"/>
+      </w:r>
+      <w:r>
+        <w:rPr>
+          <w:rFonts w:ascii="Times" w:hAnsi="Times" w:cs="Times"/>
+          <w:sz w:val="24"/>
+          <w:sz-cs w:val="24"/>
+          <w:spacing w:val="0"/>
+        </w:rPr>
+        <w:t xml:space="preserve">Both pads are </w:t>
+      </w:r>
+      <w:r>
+        <w:rPr>
+          <w:rFonts w:ascii="Times" w:hAnsi="Times" w:cs="Times"/>
+          <w:sz w:val="24"/>
+          <w:sz-cs w:val="24"/>
+          <w:b/>
+          <w:spacing w:val="0"/>
+        </w:rPr>
+        <w:t xml:space="preserve">spring-centred</w:t>
+      </w:r>
+      <w:r>
+        <w:rPr>
+          <w:rFonts w:ascii="Times" w:hAnsi="Times" w:cs="Times"/>
+          <w:sz w:val="24"/>
+          <w:sz-cs w:val="24"/>
+          <w:spacing w:val="0"/>
+        </w:rPr>
+        <w:t xml:space="preserve">: the knob follows the pointer while held, and on release it snaps back to the centre — which stops the robot and sends the brake frames immediately.</w:t>
+      </w:r>
+    </w:p>
+    <w:p>
+      <w:pPr>
+        <w:ind w:left="720" w:first-line="-720"/>
+      </w:pPr>
+      <w:r>
+        <w:rPr>
+          <w:rFonts w:ascii="Times" w:hAnsi="Times" w:cs="Times"/>
+          <w:sz w:val="24"/>
+          <w:sz-cs w:val="24"/>
+        </w:rPr>
+        <w:t xml:space="preserve"/>
+        <w:tab/>
+        <w:t xml:space="preserve">•</w:t>
+        <w:tab/>
+        <w:t xml:space="preserve"/>
+      </w:r>
+      <w:r>
+        <w:rPr>
+          <w:rFonts w:ascii="Times" w:hAnsi="Times" w:cs="Times"/>
+          <w:sz w:val="24"/>
+          <w:sz-cs w:val="24"/>
+          <w:spacing w:val="0"/>
+        </w:rPr>
+        <w:t xml:space="preserve">Drive input is sent live at ~60 Hz while a pad is held (zero-latency updates on press and move).</w:t>
+      </w:r>
+    </w:p>
+    <w:p>
+      <w:pPr>
+        <w:ind w:left="720" w:first-line="-720"/>
+      </w:pPr>
+      <w:r>
+        <w:rPr>
+          <w:rFonts w:ascii="Times" w:hAnsi="Times" w:cs="Times"/>
+          <w:sz w:val="24"/>
+          <w:sz-cs w:val="24"/>
+        </w:rPr>
+        <w:t xml:space="preserve"/>
+        <w:tab/>
+        <w:t xml:space="preserve">•</w:t>
+        <w:tab/>
+        <w:t xml:space="preserve"/>
+      </w:r>
+      <w:r>
+        <w:rPr>
+          <w:rFonts w:ascii="Times" w:hAnsi="Times" w:cs="Times"/>
+          <w:sz w:val="24"/>
+          <w:sz-cs w:val="24"/>
+          <w:spacing w:val="0"/>
+        </w:rPr>
+        <w:t xml:space="preserve">Turning and sliding are also available from the buttons above the pad, so the robot can be driven pad-only, buttons-only, or a mix.</w:t>
       </w:r>
     </w:p>
     <w:p>
@@ -1220,193 +1292,152 @@
           <w:b/>
           <w:spacing w:val="0"/>
         </w:rPr>
-        <w:t xml:space="preserve">2.3 Sensitivity and speed (Advanced)</w:t>
-      </w:r>
-    </w:p>
-    <w:p>
-      <w:pPr>
-        <w:ind w:left="720" w:first-line="-720"/>
-      </w:pPr>
-      <w:r>
-        <w:rPr>
-          <w:rFonts w:ascii="Times" w:hAnsi="Times" w:cs="Times"/>
-          <w:sz w:val="24"/>
-          <w:sz-cs w:val="24"/>
-          <w:b/>
-        </w:rPr>
-        <w:t xml:space="preserve"/>
-        <w:tab/>
-        <w:t xml:space="preserve">•</w:t>
-        <w:tab/>
-        <w:t xml:space="preserve"/>
-      </w:r>
-      <w:r>
-        <w:rPr>
-          <w:rFonts w:ascii="Times" w:hAnsi="Times" w:cs="Times"/>
-          <w:sz w:val="24"/>
-          <w:sz-cs w:val="24"/>
-          <w:b/>
-          <w:spacing w:val="0"/>
-        </w:rPr>
-        <w:t xml:space="preserve">Stick curve</w:t>
-      </w:r>
-      <w:r>
-        <w:rPr>
-          <w:rFonts w:ascii="Times" w:hAnsi="Times" w:cs="Times"/>
-          <w:sz w:val="24"/>
-          <w:sz-cs w:val="24"/>
-          <w:spacing w:val="0"/>
-        </w:rPr>
-        <w:t xml:space="preserve"> — Linear / Soft (default) / Soft+: higher curve = finer control near the centre.</w:t>
-      </w:r>
-    </w:p>
-    <w:p>
-      <w:pPr>
-        <w:ind w:left="720" w:first-line="-720"/>
-      </w:pPr>
-      <w:r>
-        <w:rPr>
-          <w:rFonts w:ascii="Times" w:hAnsi="Times" w:cs="Times"/>
-          <w:sz w:val="24"/>
-          <w:sz-cs w:val="24"/>
-          <w:b/>
-        </w:rPr>
-        <w:t xml:space="preserve"/>
-        <w:tab/>
-        <w:t xml:space="preserve">•</w:t>
-        <w:tab/>
-        <w:t xml:space="preserve"/>
-      </w:r>
-      <w:r>
-        <w:rPr>
-          <w:rFonts w:ascii="Times" w:hAnsi="Times" w:cs="Times"/>
-          <w:sz w:val="24"/>
-          <w:sz-cs w:val="24"/>
-          <w:b/>
-          <w:spacing w:val="0"/>
-        </w:rPr>
-        <w:t xml:space="preserve">Speed scale</w:t>
-      </w:r>
-      <w:r>
-        <w:rPr>
-          <w:rFonts w:ascii="Times" w:hAnsi="Times" w:cs="Times"/>
-          <w:sz w:val="24"/>
-          <w:sz-cs w:val="24"/>
-          <w:spacing w:val="0"/>
-        </w:rPr>
-        <w:t xml:space="preserve"> — 50 % / 75 % / 100 % / 150 %: multiplies the configured maxima (defaults: 0.5 m/s forward, 0.4 m/s lateral, 0.8 rad/s turn).</w:t>
-      </w:r>
-    </w:p>
-    <w:p>
-      <w:pPr>
-        <w:ind w:left="720" w:first-line="-720"/>
-      </w:pPr>
-      <w:r>
-        <w:rPr>
-          <w:rFonts w:ascii="Times" w:hAnsi="Times" w:cs="Times"/>
-          <w:sz w:val="24"/>
-          <w:sz-cs w:val="24"/>
-          <w:b/>
-        </w:rPr>
-        <w:t xml:space="preserve"/>
-        <w:tab/>
-        <w:t xml:space="preserve">•</w:t>
-        <w:tab/>
-        <w:t xml:space="preserve"/>
-      </w:r>
-      <w:r>
-        <w:rPr>
-          <w:rFonts w:ascii="Times" w:hAnsi="Times" w:cs="Times"/>
-          <w:sz w:val="24"/>
-          <w:sz-cs w:val="24"/>
-          <w:b/>
-          <w:spacing w:val="0"/>
-        </w:rPr>
-        <w:t xml:space="preserve">Forward / Turn / Lateral sign</w:t>
-      </w:r>
-      <w:r>
-        <w:rPr>
-          <w:rFonts w:ascii="Times" w:hAnsi="Times" w:cs="Times"/>
-          <w:sz w:val="24"/>
-          <w:sz-cs w:val="24"/>
-          <w:spacing w:val="0"/>
-        </w:rPr>
-        <w:t xml:space="preserve"> — flips each axis if a direction feels reversed; applied instantly.</w:t>
-      </w:r>
-    </w:p>
-    <w:p>
-      <w:pPr>
-        <w:ind w:left="720" w:first-line="-720"/>
-      </w:pPr>
-      <w:r>
-        <w:rPr>
-          <w:rFonts w:ascii="Times" w:hAnsi="Times" w:cs="Times"/>
-          <w:sz w:val="24"/>
-          <w:sz-cs w:val="24"/>
-          <w:b/>
-        </w:rPr>
-        <w:t xml:space="preserve"/>
-        <w:tab/>
-        <w:t xml:space="preserve">•</w:t>
-        <w:tab/>
-        <w:t xml:space="preserve"/>
-      </w:r>
-      <w:r>
-        <w:rPr>
-          <w:rFonts w:ascii="Times" w:hAnsi="Times" w:cs="Times"/>
-          <w:sz w:val="24"/>
-          <w:sz-cs w:val="24"/>
-          <w:b/>
-          <w:spacing w:val="0"/>
-        </w:rPr>
-        <w:t xml:space="preserve">Joystick mode</w:t>
-      </w:r>
-      <w:r>
-        <w:rPr>
-          <w:rFonts w:ascii="Times" w:hAnsi="Times" w:cs="Times"/>
-          <w:sz w:val="24"/>
-          <w:sz-cs w:val="24"/>
-          <w:spacing w:val="0"/>
-        </w:rPr>
-        <w:t xml:space="preserve"> — </w:t>
-      </w:r>
-      <w:r>
-        <w:rPr>
-          <w:rFonts w:ascii="Times" w:hAnsi="Times" w:cs="Times"/>
-          <w:sz w:val="24"/>
-          <w:sz-cs w:val="24"/>
-          <w:i/>
-          <w:spacing w:val="0"/>
-        </w:rPr>
-        <w:t xml:space="preserve">Velocity frames</w:t>
-      </w:r>
-      <w:r>
-        <w:rPr>
-          <w:rFonts w:ascii="Times" w:hAnsi="Times" w:cs="Times"/>
-          <w:sz w:val="24"/>
-          <w:sz-cs w:val="24"/>
-          <w:spacing w:val="0"/>
-        </w:rPr>
-        <w:t xml:space="preserve"> (proven) or </w:t>
-      </w:r>
-      <w:r>
-        <w:rPr>
-          <w:rFonts w:ascii="Times" w:hAnsi="Times" w:cs="Times"/>
-          <w:sz w:val="24"/>
-          <w:sz-cs w:val="24"/>
-          <w:i/>
-          <w:spacing w:val="0"/>
-        </w:rPr>
-        <w:t xml:space="preserve">Retroid / official SDK</w:t>
-      </w:r>
-      <w:r>
-        <w:rPr>
-          <w:rFonts w:ascii="Times" w:hAnsi="Times" w:cs="Times"/>
-          <w:sz w:val="24"/>
-          <w:sz-cs w:val="24"/>
-          <w:spacing w:val="0"/>
-        </w:rPr>
-        <w:t xml:space="preserve"> (sends the same 42-byte frames as the physical remote to UDP 12121).</w:t>
+        <w:t xml:space="preserve">2.3 Stopping</w:t>
+      </w:r>
+    </w:p>
+    <w:p>
+      <w:pPr>
+        <w:ind w:left="720" w:first-line="-720"/>
+      </w:pPr>
+      <w:r>
+        <w:rPr>
+          <w:rFonts w:ascii="Times" w:hAnsi="Times" w:cs="Times"/>
+          <w:sz w:val="24"/>
+          <w:sz-cs w:val="24"/>
+        </w:rPr>
+        <w:t xml:space="preserve"/>
+        <w:tab/>
+        <w:t xml:space="preserve">•</w:t>
+        <w:tab/>
+        <w:t xml:space="preserve"/>
+      </w:r>
+      <w:r>
+        <w:rPr>
+          <w:rFonts w:ascii="Times" w:hAnsi="Times" w:cs="Times"/>
+          <w:sz w:val="24"/>
+          <w:sz-cs w:val="24"/>
+          <w:spacing w:val="0"/>
+        </w:rPr>
+        <w:t xml:space="preserve">Release the pad (or return it to the centre) → stop.</w:t>
+      </w:r>
+    </w:p>
+    <w:p>
+      <w:pPr>
+        <w:ind w:left="720" w:first-line="-720"/>
+      </w:pPr>
+      <w:r>
+        <w:rPr>
+          <w:rFonts w:ascii="Times" w:hAnsi="Times" w:cs="Times"/>
+          <w:sz w:val="24"/>
+          <w:sz-cs w:val="24"/>
+          <w:b/>
+        </w:rPr>
+        <w:t xml:space="preserve"/>
+        <w:tab/>
+        <w:t xml:space="preserve">•</w:t>
+        <w:tab/>
+        <w:t xml:space="preserve"/>
+      </w:r>
+      <w:r>
+        <w:rPr>
+          <w:rFonts w:ascii="Times" w:hAnsi="Times" w:cs="Times"/>
+          <w:sz w:val="24"/>
+          <w:sz-cs w:val="24"/>
+          <w:b/>
+          <w:spacing w:val="0"/>
+        </w:rPr>
+        <w:t xml:space="preserve">STOP</w:t>
+      </w:r>
+      <w:r>
+        <w:rPr>
+          <w:rFonts w:ascii="Times" w:hAnsi="Times" w:cs="Times"/>
+          <w:sz w:val="24"/>
+          <w:sz-cs w:val="24"/>
+          <w:spacing w:val="0"/>
+        </w:rPr>
+        <w:t xml:space="preserve"> button → official brake frames (0x21010C0B with values 0 and 1).</w:t>
+      </w:r>
+    </w:p>
+    <w:p>
+      <w:pPr>
+        <w:ind w:left="720" w:first-line="-720"/>
+      </w:pPr>
+      <w:r>
+        <w:rPr>
+          <w:rFonts w:ascii="Times" w:hAnsi="Times" w:cs="Times"/>
+          <w:sz w:val="24"/>
+          <w:sz-cs w:val="24"/>
+          <w:b/>
+        </w:rPr>
+        <w:t xml:space="preserve"/>
+        <w:tab/>
+        <w:t xml:space="preserve">•</w:t>
+        <w:tab/>
+        <w:t xml:space="preserve"/>
+      </w:r>
+      <w:r>
+        <w:rPr>
+          <w:rFonts w:ascii="Times" w:hAnsi="Times" w:cs="Times"/>
+          <w:sz w:val="24"/>
+          <w:sz-cs w:val="24"/>
+          <w:b/>
+          <w:spacing w:val="0"/>
+        </w:rPr>
+        <w:t xml:space="preserve">E-STOP</w:t>
+      </w:r>
+      <w:r>
+        <w:rPr>
+          <w:rFonts w:ascii="Times" w:hAnsi="Times" w:cs="Times"/>
+          <w:sz w:val="24"/>
+          <w:sz-cs w:val="24"/>
+          <w:spacing w:val="0"/>
+        </w:rPr>
+        <w:t xml:space="preserve"> → latched: all commands are blocked until </w:t>
+      </w:r>
+      <w:r>
+        <w:rPr>
+          <w:rFonts w:ascii="Times" w:hAnsi="Times" w:cs="Times"/>
+          <w:sz w:val="24"/>
+          <w:sz-cs w:val="24"/>
+          <w:b/>
+          <w:spacing w:val="0"/>
+        </w:rPr>
+        <w:t xml:space="preserve">⟲ Return</w:t>
+      </w:r>
+      <w:r>
+        <w:rPr>
+          <w:rFonts w:ascii="Times" w:hAnsi="Times" w:cs="Times"/>
+          <w:sz w:val="24"/>
+          <w:sz-cs w:val="24"/>
+          <w:spacing w:val="0"/>
+        </w:rPr>
+        <w:t xml:space="preserve"> is pressed (also cancels any action mid-play).</w:t>
+      </w:r>
+    </w:p>
+    <w:p>
+      <w:pPr>
+        <w:ind w:left="720" w:first-line="-720"/>
+      </w:pPr>
+      <w:r>
+        <w:rPr>
+          <w:rFonts w:ascii="Times" w:hAnsi="Times" w:cs="Times"/>
+          <w:sz w:val="24"/>
+          <w:sz-cs w:val="24"/>
+        </w:rPr>
+        <w:t xml:space="preserve"/>
+        <w:tab/>
+        <w:t xml:space="preserve">•</w:t>
+        <w:tab/>
+        <w:t xml:space="preserve"/>
+      </w:r>
+      <w:r>
+        <w:rPr>
+          <w:rFonts w:ascii="Times" w:hAnsi="Times" w:cs="Times"/>
+          <w:sz w:val="24"/>
+          <w:sz-cs w:val="24"/>
+          <w:spacing w:val="0"/>
+        </w:rPr>
+        <w:t xml:space="preserve">Switching browser tab, minimising the window or losing focus also stops the robot (safety).</w:t>
       </w:r>
     </w:p>
     <w:p>
@@ -1421,7 +1452,245 @@
           <w:b/>
           <w:spacing w:val="0"/>
         </w:rPr>
-        <w:t xml:space="preserve">2.4 Keyboard (alternative to the sticks)</w:t>
+        <w:t xml:space="preserve">2.4 Tuning (Advanced panel)</w:t>
+      </w:r>
+    </w:p>
+    <w:p>
+      <w:pPr>
+        <w:ind w:left="720" w:first-line="-720"/>
+      </w:pPr>
+      <w:r>
+        <w:rPr>
+          <w:rFonts w:ascii="Times" w:hAnsi="Times" w:cs="Times"/>
+          <w:sz w:val="24"/>
+          <w:sz-cs w:val="24"/>
+          <w:b/>
+        </w:rPr>
+        <w:t xml:space="preserve"/>
+        <w:tab/>
+        <w:t xml:space="preserve">•</w:t>
+        <w:tab/>
+        <w:t xml:space="preserve"/>
+      </w:r>
+      <w:r>
+        <w:rPr>
+          <w:rFonts w:ascii="Times" w:hAnsi="Times" w:cs="Times"/>
+          <w:sz w:val="24"/>
+          <w:sz-cs w:val="24"/>
+          <w:b/>
+          <w:spacing w:val="0"/>
+        </w:rPr>
+        <w:t xml:space="preserve">Stick curve</w:t>
+      </w:r>
+      <w:r>
+        <w:rPr>
+          <w:rFonts w:ascii="Times" w:hAnsi="Times" w:cs="Times"/>
+          <w:sz w:val="24"/>
+          <w:sz-cs w:val="24"/>
+          <w:spacing w:val="0"/>
+        </w:rPr>
+        <w:t xml:space="preserve"> — Linear / Soft (default, 1.25) / Soft+: higher value = finer control near the centre, which is what most people want for delicate moves.</w:t>
+      </w:r>
+    </w:p>
+    <w:p>
+      <w:pPr>
+        <w:ind w:left="720" w:first-line="-720"/>
+      </w:pPr>
+      <w:r>
+        <w:rPr>
+          <w:rFonts w:ascii="Times" w:hAnsi="Times" w:cs="Times"/>
+          <w:sz w:val="24"/>
+          <w:sz-cs w:val="24"/>
+          <w:b/>
+        </w:rPr>
+        <w:t xml:space="preserve"/>
+        <w:tab/>
+        <w:t xml:space="preserve">•</w:t>
+        <w:tab/>
+        <w:t xml:space="preserve"/>
+      </w:r>
+      <w:r>
+        <w:rPr>
+          <w:rFonts w:ascii="Times" w:hAnsi="Times" w:cs="Times"/>
+          <w:sz w:val="24"/>
+          <w:sz-cs w:val="24"/>
+          <w:b/>
+          <w:spacing w:val="0"/>
+        </w:rPr>
+        <w:t xml:space="preserve">Speed scale</w:t>
+      </w:r>
+      <w:r>
+        <w:rPr>
+          <w:rFonts w:ascii="Times" w:hAnsi="Times" w:cs="Times"/>
+          <w:sz w:val="24"/>
+          <w:sz-cs w:val="24"/>
+          <w:spacing w:val="0"/>
+        </w:rPr>
+        <w:t xml:space="preserve"> — 50 % / 75 % / 100 % (default) / 150 %: multiplies the configured maxima below.</w:t>
+      </w:r>
+    </w:p>
+    <w:p>
+      <w:pPr>
+        <w:ind w:left="720" w:first-line="-720"/>
+      </w:pPr>
+      <w:r>
+        <w:rPr>
+          <w:rFonts w:ascii="Times" w:hAnsi="Times" w:cs="Times"/>
+          <w:sz w:val="24"/>
+          <w:sz-cs w:val="24"/>
+          <w:b/>
+        </w:rPr>
+        <w:t xml:space="preserve"/>
+        <w:tab/>
+        <w:t xml:space="preserve">•</w:t>
+        <w:tab/>
+        <w:t xml:space="preserve"/>
+      </w:r>
+      <w:r>
+        <w:rPr>
+          <w:rFonts w:ascii="Times" w:hAnsi="Times" w:cs="Times"/>
+          <w:sz w:val="24"/>
+          <w:sz-cs w:val="24"/>
+          <w:b/>
+          <w:spacing w:val="0"/>
+        </w:rPr>
+        <w:t xml:space="preserve">Configured maxima</w:t>
+      </w:r>
+      <w:r>
+        <w:rPr>
+          <w:rFonts w:ascii="Times" w:hAnsi="Times" w:cs="Times"/>
+          <w:sz w:val="24"/>
+          <w:sz-cs w:val="24"/>
+          <w:spacing w:val="0"/>
+        </w:rPr>
+        <w:t xml:space="preserve"> — forward/back 0.5 m/s, lateral slide 0.4 m/s, turn 0.8 rad/s.</w:t>
+      </w:r>
+    </w:p>
+    <w:p>
+      <w:pPr>
+        <w:ind w:left="720" w:first-line="-720"/>
+      </w:pPr>
+      <w:r>
+        <w:rPr>
+          <w:rFonts w:ascii="Times" w:hAnsi="Times" w:cs="Times"/>
+          <w:sz w:val="24"/>
+          <w:sz-cs w:val="24"/>
+          <w:b/>
+        </w:rPr>
+        <w:t xml:space="preserve"/>
+        <w:tab/>
+        <w:t xml:space="preserve">•</w:t>
+        <w:tab/>
+        <w:t xml:space="preserve"/>
+      </w:r>
+      <w:r>
+        <w:rPr>
+          <w:rFonts w:ascii="Times" w:hAnsi="Times" w:cs="Times"/>
+          <w:sz w:val="24"/>
+          <w:sz-cs w:val="24"/>
+          <w:b/>
+          <w:spacing w:val="0"/>
+        </w:rPr>
+        <w:t xml:space="preserve">Forward sign / Turn sign / Lateral sign</w:t>
+      </w:r>
+      <w:r>
+        <w:rPr>
+          <w:rFonts w:ascii="Times" w:hAnsi="Times" w:cs="Times"/>
+          <w:sz w:val="24"/>
+          <w:sz-cs w:val="24"/>
+          <w:spacing w:val="0"/>
+        </w:rPr>
+        <w:t xml:space="preserve"> — flips the axis if a direction is reversed on your unit; changes apply immediately.</w:t>
+      </w:r>
+    </w:p>
+    <w:p>
+      <w:pPr>
+        <w:ind w:left="720" w:first-line="-720"/>
+      </w:pPr>
+      <w:r>
+        <w:rPr>
+          <w:rFonts w:ascii="Times" w:hAnsi="Times" w:cs="Times"/>
+          <w:sz w:val="24"/>
+          <w:sz-cs w:val="24"/>
+          <w:b/>
+        </w:rPr>
+        <w:t xml:space="preserve"/>
+        <w:tab/>
+        <w:t xml:space="preserve">•</w:t>
+        <w:tab/>
+        <w:t xml:space="preserve"/>
+      </w:r>
+      <w:r>
+        <w:rPr>
+          <w:rFonts w:ascii="Times" w:hAnsi="Times" w:cs="Times"/>
+          <w:sz w:val="24"/>
+          <w:sz-cs w:val="24"/>
+          <w:b/>
+          <w:spacing w:val="0"/>
+        </w:rPr>
+        <w:t xml:space="preserve">Joystick mode</w:t>
+      </w:r>
+      <w:r>
+        <w:rPr>
+          <w:rFonts w:ascii="Times" w:hAnsi="Times" w:cs="Times"/>
+          <w:sz w:val="24"/>
+          <w:sz-cs w:val="24"/>
+          <w:spacing w:val="0"/>
+        </w:rPr>
+        <w:t xml:space="preserve"> — </w:t>
+      </w:r>
+      <w:r>
+        <w:rPr>
+          <w:rFonts w:ascii="Times" w:hAnsi="Times" w:cs="Times"/>
+          <w:sz w:val="24"/>
+          <w:sz-cs w:val="24"/>
+          <w:i/>
+          <w:spacing w:val="0"/>
+        </w:rPr>
+        <w:t xml:space="preserve">Velocity frames (proven)</w:t>
+      </w:r>
+      <w:r>
+        <w:rPr>
+          <w:rFonts w:ascii="Times" w:hAnsi="Times" w:cs="Times"/>
+          <w:sz w:val="24"/>
+          <w:sz-cs w:val="24"/>
+          <w:spacing w:val="0"/>
+        </w:rPr>
+        <w:t xml:space="preserve"> sends the standard velocity frames (0x140 / 0x145 / 0x141); </w:t>
+      </w:r>
+      <w:r>
+        <w:rPr>
+          <w:rFonts w:ascii="Times" w:hAnsi="Times" w:cs="Times"/>
+          <w:sz w:val="24"/>
+          <w:sz-cs w:val="24"/>
+          <w:i/>
+          <w:spacing w:val="0"/>
+        </w:rPr>
+        <w:t xml:space="preserve">Retroid / official SDK</w:t>
+      </w:r>
+      <w:r>
+        <w:rPr>
+          <w:rFonts w:ascii="Times" w:hAnsi="Times" w:cs="Times"/>
+          <w:sz w:val="24"/>
+          <w:sz-cs w:val="24"/>
+          <w:spacing w:val="0"/>
+        </w:rPr>
+        <w:t xml:space="preserve"> instead sends the same 42-byte frames as the physical remote (UDP 12121) and lets the robot's own controller interpret the sticks.</w:t>
+      </w:r>
+    </w:p>
+    <w:p>
+      <w:pPr>
+        <w:spacing w:after="298"/>
+      </w:pPr>
+      <w:r>
+        <w:rPr>
+          <w:rFonts w:ascii="Times" w:hAnsi="Times" w:cs="Times"/>
+          <w:sz w:val="36"/>
+          <w:sz-cs w:val="36"/>
+          <w:b/>
+          <w:spacing w:val="0"/>
+        </w:rPr>
+        <w:t xml:space="preserve">2.5 Keyboard (alternative to the pads)</w:t>
       </w:r>
     </w:p>
     <w:p>
@@ -1458,7 +1727,7 @@
           <w:sz-cs w:val="24"/>
           <w:spacing w:val="0"/>
         </w:rPr>
-        <w:t xml:space="preserve"> (or ↑/↓) — forward / back · </w:t>
+        <w:t xml:space="preserve"> (or ↑ / ↓) — forward / back · </w:t>
       </w:r>
       <w:r>
         <w:rPr>
@@ -1477,7 +1746,25 @@
           <w:sz-cs w:val="24"/>
           <w:spacing w:val="0"/>
         </w:rPr>
-        <w:t xml:space="preserve"> (or ←/→) — turn · </w:t>
+        <w:t xml:space="preserve"> (or ← / →) — turn.</w:t>
+      </w:r>
+    </w:p>
+    <w:p>
+      <w:pPr>
+        <w:ind w:left="720" w:first-line="-720"/>
+      </w:pPr>
+      <w:r>
+        <w:rPr>
+          <w:rFonts w:ascii="Times" w:hAnsi="Times" w:cs="Times"/>
+          <w:sz w:val="24"/>
+          <w:sz-cs w:val="24"/>
+          <w:b/>
+        </w:rPr>
+        <w:t xml:space="preserve"/>
+        <w:tab/>
+        <w:t xml:space="preserve">•</w:t>
+        <w:tab/>
+        <w:t xml:space="preserve"/>
       </w:r>
       <w:r>
         <w:rPr>
@@ -1496,7 +1783,33 @@
           <w:sz-cs w:val="24"/>
           <w:spacing w:val="0"/>
         </w:rPr>
-        <w:t xml:space="preserve"> — E-stop (hold) · leaving the keys stops the robot.</w:t>
+        <w:t xml:space="preserve"> — hold-to E-stop.</w:t>
+      </w:r>
+    </w:p>
+    <w:p>
+      <w:pPr>
+        <w:ind w:left="720" w:first-line="-720"/>
+      </w:pPr>
+      <w:r>
+        <w:rPr>
+          <w:rFonts w:ascii="Times" w:hAnsi="Times" w:cs="Times"/>
+          <w:sz w:val="24"/>
+          <w:sz-cs w:val="24"/>
+        </w:rPr>
+        <w:t xml:space="preserve"/>
+        <w:tab/>
+        <w:t xml:space="preserve">•</w:t>
+        <w:tab/>
+        <w:t xml:space="preserve"/>
+      </w:r>
+      <w:r>
+        <w:rPr>
+          <w:rFonts w:ascii="Times" w:hAnsi="Times" w:cs="Times"/>
+          <w:sz w:val="24"/>
+          <w:sz-cs w:val="24"/>
+          <w:spacing w:val="0"/>
+        </w:rPr>
+        <w:t xml:space="preserve">Releasing the keys stops the robot; keys and pads can be mixed.</w:t>
       </w:r>
     </w:p>
     <w:p>

</xml_diff>